<commit_message>
fix: drag and drop file upload across all uploaders
- Root cause: missing onDrop handler let browser open files natively
- Switch drop zones from label to div with programmatic input click
- Add onDrop with preventDefault + stopPropagation on all three uploaders
- Extract processFile() so both click and drop use the same logic
- Add isDragOver state for visual feedback (blue border + tinted bg + label change)
</commit_message>
<xml_diff>
--- a/testing-guide-admin.docx
+++ b/testing-guide-admin.docx
@@ -21,7 +21,7 @@
     </w:p>
     <w:p>
       <w:pPr>
-        <w:spacing w:after="320"/>
+        <w:spacing w:after="80"/>
         <w:jc w:val="center"/>
       </w:pPr>
       <w:r>
@@ -31,7 +31,24 @@
           <w:sz w:val="26"/>
           <w:szCs w:val="26"/>
         </w:rPr>
-        <w:t xml:space="preserve">Admin Testing Guide — Content Creator</w:t>
+        <w:t xml:space="preserve">Admin Testing Guide -- Content Creator</w:t>
+      </w:r>
+    </w:p>
+    <w:p>
+      <w:pPr>
+        <w:spacing w:after="320"/>
+        <w:jc w:val="center"/>
+      </w:pPr>
+      <w:r>
+        <w:rPr>
+          <w:rFonts w:ascii="Arial" w:cs="Arial" w:eastAsia="Arial" w:hAnsi="Arial"/>
+          <w:i/>
+          <w:iCs/>
+          <w:color w:val="94a3b8"/>
+          <w:sz w:val="20"/>
+          <w:szCs w:val="20"/>
+        </w:rPr>
+        <w:t xml:space="preserve">Updated June 2026</w:t>
       </w:r>
     </w:p>
     <w:p>
@@ -39,11 +56,7 @@
         <w:spacing w:after="120"/>
       </w:pPr>
       <w:r>
-        <w:rPr>
-          <w:sz w:val="22"/>
-          <w:szCs w:val="22"/>
-        </w:rPr>
-        <w:t xml:space="preserve">This guide is for testing the admin side of the app — the tools for building and managing studies. Set aside about 20–30 minutes. Sign in with your admin account at the site link Corey gave you.</w:t>
+        <w:t xml:space="preserve">This guide covers the admin side of the app -- the tools for building and managing studies. Set aside about 20 to 30 minutes. Sign in with your admin account at the site link Corey gave you.</w:t>
       </w:r>
     </w:p>
     <w:p>
@@ -67,7 +80,7 @@
           <w:sz w:val="18"/>
           <w:szCs w:val="18"/>
         </w:rPr>
-        <w:t xml:space="preserve">Part 1 — Study Seeds</w:t>
+        <w:t xml:space="preserve">Part 1 -- Landing Page &amp; Dashboard</w:t>
       </w:r>
     </w:p>
     <w:p>
@@ -75,142 +88,75 @@
         <w:spacing w:after="120"/>
       </w:pPr>
       <w:r>
-        <w:t xml:space="preserve">Seeds is where you capture raw notes, references, and ideas before turning them into full studies — think of it like a digital index card box.</w:t>
-      </w:r>
-    </w:p>
-    <w:p>
-      <w:pPr>
-        <w:pStyle w:val="ListParagraph"/>
-        <w:numPr>
-          <w:ilvl w:val="0"/>
-          <w:numId w:val="2"/>
-        </w:numPr>
-        <w:spacing w:after="100"/>
-      </w:pPr>
-      <w:r>
-        <w:rPr>
-          <w:sz w:val="22"/>
-          <w:szCs w:val="22"/>
-        </w:rPr>
-        <w:t xml:space="preserve">Go to Seeds in the left menu.</w:t>
-      </w:r>
-    </w:p>
-    <w:p>
-      <w:pPr>
-        <w:pStyle w:val="ListParagraph"/>
-        <w:numPr>
-          <w:ilvl w:val="0"/>
-          <w:numId w:val="2"/>
-        </w:numPr>
-        <w:spacing w:after="100"/>
-      </w:pPr>
-      <w:r>
-        <w:rPr>
-          <w:sz w:val="22"/>
-          <w:szCs w:val="22"/>
-        </w:rPr>
-        <w:t xml:space="preserve">Tap + New Seed.</w:t>
-      </w:r>
-    </w:p>
-    <w:p>
-      <w:pPr>
-        <w:pStyle w:val="ListParagraph"/>
-        <w:numPr>
-          <w:ilvl w:val="0"/>
-          <w:numId w:val="2"/>
-        </w:numPr>
-        <w:spacing w:after="100"/>
-      </w:pPr>
-      <w:r>
-        <w:rPr>
-          <w:sz w:val="22"/>
-          <w:szCs w:val="22"/>
-        </w:rPr>
-        <w:t xml:space="preserve">Enter a title, some Bible references, and a few notes from one of your text files.</w:t>
-      </w:r>
-    </w:p>
-    <w:p>
-      <w:pPr>
-        <w:pStyle w:val="ListParagraph"/>
-        <w:numPr>
-          <w:ilvl w:val="0"/>
-          <w:numId w:val="2"/>
-        </w:numPr>
-        <w:spacing w:after="100"/>
-      </w:pPr>
-      <w:r>
-        <w:rPr>
-          <w:sz w:val="22"/>
-          <w:szCs w:val="22"/>
-        </w:rPr>
-        <w:t xml:space="preserve">Change the status from "Seed" to "Draft" and save.</w:t>
-      </w:r>
-    </w:p>
-    <w:p>
-      <w:pPr>
-        <w:pStyle w:val="ListParagraph"/>
-        <w:numPr>
-          <w:ilvl w:val="0"/>
-          <w:numId w:val="2"/>
-        </w:numPr>
-        <w:spacing w:after="100"/>
-      </w:pPr>
-      <w:r>
-        <w:rPr>
-          <w:sz w:val="22"/>
-          <w:szCs w:val="22"/>
-        </w:rPr>
-        <w:t xml:space="preserve">Check that it shows up in your list. Try the filter tabs (All / Seed / Draft / Ready).</w:t>
-      </w:r>
-    </w:p>
-    <w:p>
-      <w:pPr>
-        <w:spacing w:after="160"/>
-      </w:pPr>
-      <w:r>
-        <w:t xml:space="preserve"/>
-      </w:r>
-    </w:p>
-    <w:p>
-      <w:pPr>
-        <w:spacing w:after="120"/>
-      </w:pPr>
-      <w:r>
-        <w:t xml:space="preserve">Questions:</w:t>
-      </w:r>
-    </w:p>
-    <w:p>
-      <w:pPr>
-        <w:pStyle w:val="ListParagraph"/>
-        <w:numPr>
-          <w:ilvl w:val="0"/>
-          <w:numId w:val="3"/>
-        </w:numPr>
-        <w:spacing w:after="80"/>
-      </w:pPr>
-      <w:r>
-        <w:rPr>
-          <w:sz w:val="22"/>
-          <w:szCs w:val="22"/>
-        </w:rPr>
-        <w:t xml:space="preserve">Does this feel like a useful place to keep your notes?</w:t>
-      </w:r>
-    </w:p>
-    <w:p>
-      <w:pPr>
-        <w:pStyle w:val="ListParagraph"/>
-        <w:numPr>
-          <w:ilvl w:val="0"/>
-          <w:numId w:val="3"/>
-        </w:numPr>
-        <w:spacing w:after="80"/>
-      </w:pPr>
-      <w:r>
-        <w:rPr>
-          <w:sz w:val="22"/>
-          <w:szCs w:val="22"/>
-        </w:rPr>
-        <w:t xml:space="preserve">Is anything missing that you'd want?</w:t>
+        <w:t xml:space="preserve">Sign out first if you are already logged in, so you can see what a new visitor sees.</w:t>
+      </w:r>
+    </w:p>
+    <w:p>
+      <w:pPr>
+        <w:pStyle w:val="ListParagraph"/>
+        <w:numPr>
+          <w:ilvl w:val="0"/>
+          <w:numId w:val="2"/>
+        </w:numPr>
+        <w:spacing w:after="100"/>
+      </w:pPr>
+      <w:r>
+        <w:rPr>
+          <w:sz w:val="22"/>
+          <w:szCs w:val="22"/>
+        </w:rPr>
+        <w:t xml:space="preserve">Go to the site URL. You should see a welcome page with an "Enter Passcode" button and a "Sign In" link in the top corner.</w:t>
+      </w:r>
+    </w:p>
+    <w:p>
+      <w:pPr>
+        <w:pStyle w:val="ListParagraph"/>
+        <w:numPr>
+          <w:ilvl w:val="0"/>
+          <w:numId w:val="2"/>
+        </w:numPr>
+        <w:spacing w:after="100"/>
+      </w:pPr>
+      <w:r>
+        <w:rPr>
+          <w:sz w:val="22"/>
+          <w:szCs w:val="22"/>
+        </w:rPr>
+        <w:t xml:space="preserve">Tap Sign In and log in with your admin account.</w:t>
+      </w:r>
+    </w:p>
+    <w:p>
+      <w:pPr>
+        <w:pStyle w:val="ListParagraph"/>
+        <w:numPr>
+          <w:ilvl w:val="0"/>
+          <w:numId w:val="2"/>
+        </w:numPr>
+        <w:spacing w:after="100"/>
+      </w:pPr>
+      <w:r>
+        <w:rPr>
+          <w:sz w:val="22"/>
+          <w:szCs w:val="22"/>
+        </w:rPr>
+        <w:t xml:space="preserve">You should land on the Dashboard. Does it show Featured Tracks and Recent Studies sections?</w:t>
+      </w:r>
+    </w:p>
+    <w:p>
+      <w:pPr>
+        <w:pStyle w:val="ListParagraph"/>
+        <w:numPr>
+          <w:ilvl w:val="0"/>
+          <w:numId w:val="2"/>
+        </w:numPr>
+        <w:spacing w:after="100"/>
+      </w:pPr>
+      <w:r>
+        <w:rPr>
+          <w:sz w:val="22"/>
+          <w:szCs w:val="22"/>
+        </w:rPr>
+        <w:t xml:space="preserve">Does the greeting say "Welcome back" with your name?</w:t>
       </w:r>
     </w:p>
     <w:p>
@@ -234,75 +180,133 @@
           <w:sz w:val="18"/>
           <w:szCs w:val="18"/>
         </w:rPr>
-        <w:t xml:space="preserve">Part 2 — Studies</w:t>
-      </w:r>
-    </w:p>
-    <w:p>
-      <w:pPr>
-        <w:pStyle w:val="ListParagraph"/>
-        <w:numPr>
-          <w:ilvl w:val="0"/>
-          <w:numId w:val="2"/>
-        </w:numPr>
-        <w:spacing w:after="100"/>
-      </w:pPr>
-      <w:r>
-        <w:rPr>
-          <w:sz w:val="22"/>
-          <w:szCs w:val="22"/>
-        </w:rPr>
-        <w:t xml:space="preserve">Go to Studies in the left menu.</w:t>
-      </w:r>
-    </w:p>
-    <w:p>
-      <w:pPr>
-        <w:pStyle w:val="ListParagraph"/>
-        <w:numPr>
-          <w:ilvl w:val="0"/>
-          <w:numId w:val="2"/>
-        </w:numPr>
-        <w:spacing w:after="100"/>
-      </w:pPr>
-      <w:r>
-        <w:rPr>
-          <w:sz w:val="22"/>
-          <w:szCs w:val="22"/>
-        </w:rPr>
-        <w:t xml:space="preserve">Open an existing study.</w:t>
-      </w:r>
-    </w:p>
-    <w:p>
-      <w:pPr>
-        <w:pStyle w:val="ListParagraph"/>
-        <w:numPr>
-          <w:ilvl w:val="0"/>
-          <w:numId w:val="2"/>
-        </w:numPr>
-        <w:spacing w:after="100"/>
-      </w:pPr>
-      <w:r>
-        <w:rPr>
-          <w:sz w:val="22"/>
-          <w:szCs w:val="22"/>
-        </w:rPr>
-        <w:t xml:space="preserve">Try changing something small — like the key verse or description — and save.</w:t>
-      </w:r>
-    </w:p>
-    <w:p>
-      <w:pPr>
-        <w:pStyle w:val="ListParagraph"/>
-        <w:numPr>
-          <w:ilvl w:val="0"/>
-          <w:numId w:val="2"/>
-        </w:numPr>
-        <w:spacing w:after="100"/>
-      </w:pPr>
-      <w:r>
-        <w:rPr>
-          <w:sz w:val="22"/>
-          <w:szCs w:val="22"/>
-        </w:rPr>
-        <w:t xml:space="preserve">Go back to the Studies list. Does your change appear?</w:t>
+        <w:t xml:space="preserve">Part 2 -- Study Seeds</w:t>
+      </w:r>
+    </w:p>
+    <w:p>
+      <w:pPr>
+        <w:spacing w:after="120"/>
+      </w:pPr>
+      <w:r>
+        <w:t xml:space="preserve">Seeds is where you capture raw notes, references, and ideas before turning them into full studies. Think of it as a digital version of your open text files.</w:t>
+      </w:r>
+    </w:p>
+    <w:p>
+      <w:pPr>
+        <w:pStyle w:val="ListParagraph"/>
+        <w:numPr>
+          <w:ilvl w:val="0"/>
+          <w:numId w:val="2"/>
+        </w:numPr>
+        <w:spacing w:after="100"/>
+      </w:pPr>
+      <w:r>
+        <w:rPr>
+          <w:sz w:val="22"/>
+          <w:szCs w:val="22"/>
+        </w:rPr>
+        <w:t xml:space="preserve">Go to Seeds in the left menu.</w:t>
+      </w:r>
+    </w:p>
+    <w:p>
+      <w:pPr>
+        <w:pStyle w:val="ListParagraph"/>
+        <w:numPr>
+          <w:ilvl w:val="0"/>
+          <w:numId w:val="2"/>
+        </w:numPr>
+        <w:spacing w:after="100"/>
+      </w:pPr>
+      <w:r>
+        <w:rPr>
+          <w:sz w:val="22"/>
+          <w:szCs w:val="22"/>
+        </w:rPr>
+        <w:t xml:space="preserve">Tap + New Seed. Enter a title, some Bible references, and paste in some notes.</w:t>
+      </w:r>
+    </w:p>
+    <w:p>
+      <w:pPr>
+        <w:pStyle w:val="ListParagraph"/>
+        <w:numPr>
+          <w:ilvl w:val="0"/>
+          <w:numId w:val="2"/>
+        </w:numPr>
+        <w:spacing w:after="100"/>
+      </w:pPr>
+      <w:r>
+        <w:rPr>
+          <w:sz w:val="22"/>
+          <w:szCs w:val="22"/>
+        </w:rPr>
+        <w:t xml:space="preserve">Save it, then change the status from Seed to Draft.</w:t>
+      </w:r>
+    </w:p>
+    <w:p>
+      <w:pPr>
+        <w:pStyle w:val="ListParagraph"/>
+        <w:numPr>
+          <w:ilvl w:val="0"/>
+          <w:numId w:val="2"/>
+        </w:numPr>
+        <w:spacing w:after="100"/>
+      </w:pPr>
+      <w:r>
+        <w:rPr>
+          <w:sz w:val="22"/>
+          <w:szCs w:val="22"/>
+        </w:rPr>
+        <w:t xml:space="preserve">Try the filter tabs at the top (All / Seed / Draft / Ready). Do they filter correctly?</w:t>
+      </w:r>
+    </w:p>
+    <w:p>
+      <w:pPr>
+        <w:spacing w:after="160"/>
+      </w:pPr>
+      <w:r>
+        <w:t xml:space="preserve"/>
+      </w:r>
+    </w:p>
+    <w:p>
+      <w:pPr>
+        <w:spacing w:after="120"/>
+      </w:pPr>
+      <w:r>
+        <w:t xml:space="preserve">Questions:</w:t>
+      </w:r>
+    </w:p>
+    <w:p>
+      <w:pPr>
+        <w:pStyle w:val="ListParagraph"/>
+        <w:numPr>
+          <w:ilvl w:val="0"/>
+          <w:numId w:val="3"/>
+        </w:numPr>
+        <w:spacing w:after="80"/>
+      </w:pPr>
+      <w:r>
+        <w:rPr>
+          <w:sz w:val="22"/>
+          <w:szCs w:val="22"/>
+        </w:rPr>
+        <w:t xml:space="preserve">Does this feel like a useful place to keep your notes?</w:t>
+      </w:r>
+    </w:p>
+    <w:p>
+      <w:pPr>
+        <w:pStyle w:val="ListParagraph"/>
+        <w:numPr>
+          <w:ilvl w:val="0"/>
+          <w:numId w:val="3"/>
+        </w:numPr>
+        <w:spacing w:after="80"/>
+      </w:pPr>
+      <w:r>
+        <w:rPr>
+          <w:sz w:val="22"/>
+          <w:szCs w:val="22"/>
+        </w:rPr>
+        <w:t xml:space="preserve">Is anything missing that you would want?</w:t>
       </w:r>
     </w:p>
     <w:p>
@@ -326,7 +330,7 @@
           <w:sz w:val="18"/>
           <w:szCs w:val="18"/>
         </w:rPr>
-        <w:t xml:space="preserve">Part 3 — The Study Viewer</w:t>
+        <w:t xml:space="preserve">Part 3 -- Study Editor</w:t>
       </w:r>
     </w:p>
     <w:p>
@@ -334,126 +338,75 @@
         <w:spacing w:after="120"/>
       </w:pPr>
       <w:r>
-        <w:t xml:space="preserve">This is what your audience sees. Test it like a normal user would.</w:t>
-      </w:r>
-    </w:p>
-    <w:p>
-      <w:pPr>
-        <w:pStyle w:val="ListParagraph"/>
-        <w:numPr>
-          <w:ilvl w:val="0"/>
-          <w:numId w:val="2"/>
-        </w:numPr>
-        <w:spacing w:after="100"/>
-      </w:pPr>
-      <w:r>
-        <w:rPr>
-          <w:sz w:val="22"/>
-          <w:szCs w:val="22"/>
-        </w:rPr>
-        <w:t xml:space="preserve">Find a study with a video or audio attached and tap View.</w:t>
-      </w:r>
-    </w:p>
-    <w:p>
-      <w:pPr>
-        <w:pStyle w:val="ListParagraph"/>
-        <w:numPr>
-          <w:ilvl w:val="0"/>
-          <w:numId w:val="2"/>
-        </w:numPr>
-        <w:spacing w:after="100"/>
-      </w:pPr>
-      <w:r>
-        <w:rPr>
-          <w:sz w:val="22"/>
-          <w:szCs w:val="22"/>
-        </w:rPr>
-        <w:t xml:space="preserve">Watch or listen to part of it. Does it play correctly?</w:t>
-      </w:r>
-    </w:p>
-    <w:p>
-      <w:pPr>
-        <w:pStyle w:val="ListParagraph"/>
-        <w:numPr>
-          <w:ilvl w:val="0"/>
-          <w:numId w:val="2"/>
-        </w:numPr>
-        <w:spacing w:after="100"/>
-      </w:pPr>
-      <w:r>
-        <w:rPr>
-          <w:sz w:val="22"/>
-          <w:szCs w:val="22"/>
-        </w:rPr>
-        <w:t xml:space="preserve">Tap the Scripture tab. Does the passage load?</w:t>
-      </w:r>
-    </w:p>
-    <w:p>
-      <w:pPr>
-        <w:pStyle w:val="ListParagraph"/>
-        <w:numPr>
-          <w:ilvl w:val="0"/>
-          <w:numId w:val="2"/>
-        </w:numPr>
-        <w:spacing w:after="100"/>
-      </w:pPr>
-      <w:r>
-        <w:rPr>
-          <w:sz w:val="22"/>
-          <w:szCs w:val="22"/>
-        </w:rPr>
-        <w:t xml:space="preserve">Try switching Bible translations using the buttons at the top.</w:t>
-      </w:r>
-    </w:p>
-    <w:p>
-      <w:pPr>
-        <w:pStyle w:val="ListParagraph"/>
-        <w:numPr>
-          <w:ilvl w:val="0"/>
-          <w:numId w:val="2"/>
-        </w:numPr>
-        <w:spacing w:after="100"/>
-      </w:pPr>
-      <w:r>
-        <w:rPr>
-          <w:sz w:val="22"/>
-          <w:szCs w:val="22"/>
-        </w:rPr>
-        <w:t xml:space="preserve">Tap the Notes tab and type something. Watch for "Saved ✓".</w:t>
-      </w:r>
-    </w:p>
-    <w:p>
-      <w:pPr>
-        <w:pStyle w:val="ListParagraph"/>
-        <w:numPr>
-          <w:ilvl w:val="0"/>
-          <w:numId w:val="2"/>
-        </w:numPr>
-        <w:spacing w:after="100"/>
-      </w:pPr>
-      <w:r>
-        <w:rPr>
-          <w:sz w:val="22"/>
-          <w:szCs w:val="22"/>
-        </w:rPr>
-        <w:t xml:space="preserve">If there are Related Studies listed, tap one. Does the passage appear?</w:t>
-      </w:r>
-    </w:p>
-    <w:p>
-      <w:pPr>
-        <w:pStyle w:val="ListParagraph"/>
-        <w:numPr>
-          <w:ilvl w:val="0"/>
-          <w:numId w:val="2"/>
-        </w:numPr>
-        <w:spacing w:after="100"/>
-      </w:pPr>
-      <w:r>
-        <w:rPr>
-          <w:sz w:val="22"/>
-          <w:szCs w:val="22"/>
-        </w:rPr>
-        <w:t xml:space="preserve">Use the ← → arrows to move to the next study.</w:t>
+        <w:t xml:space="preserve">There are a few updates to the study editor since we first built it.</w:t>
+      </w:r>
+    </w:p>
+    <w:p>
+      <w:pPr>
+        <w:pStyle w:val="ListParagraph"/>
+        <w:numPr>
+          <w:ilvl w:val="0"/>
+          <w:numId w:val="2"/>
+        </w:numPr>
+        <w:spacing w:after="100"/>
+      </w:pPr>
+      <w:r>
+        <w:rPr>
+          <w:sz w:val="22"/>
+          <w:szCs w:val="22"/>
+        </w:rPr>
+        <w:t xml:space="preserve">Go to Studies and open an existing study.</w:t>
+      </w:r>
+    </w:p>
+    <w:p>
+      <w:pPr>
+        <w:pStyle w:val="ListParagraph"/>
+        <w:numPr>
+          <w:ilvl w:val="0"/>
+          <w:numId w:val="2"/>
+        </w:numPr>
+        <w:spacing w:after="100"/>
+      </w:pPr>
+      <w:r>
+        <w:rPr>
+          <w:sz w:val="22"/>
+          <w:szCs w:val="22"/>
+        </w:rPr>
+        <w:t xml:space="preserve">Scroll to the Content section. You should see a new Tags field below the Summary. Add a few tags separated by commas -- do they appear as colored pills below the field when you click away?</w:t>
+      </w:r>
+    </w:p>
+    <w:p>
+      <w:pPr>
+        <w:pStyle w:val="ListParagraph"/>
+        <w:numPr>
+          <w:ilvl w:val="0"/>
+          <w:numId w:val="2"/>
+        </w:numPr>
+        <w:spacing w:after="100"/>
+      </w:pPr>
+      <w:r>
+        <w:rPr>
+          <w:sz w:val="22"/>
+          <w:szCs w:val="22"/>
+        </w:rPr>
+        <w:t xml:space="preserve">Scroll to the top right corner and look for the "View Study" button. Tap it -- does it open the study viewer correctly? (This was broken before and is now fixed.)</w:t>
+      </w:r>
+    </w:p>
+    <w:p>
+      <w:pPr>
+        <w:pStyle w:val="ListParagraph"/>
+        <w:numPr>
+          <w:ilvl w:val="0"/>
+          <w:numId w:val="2"/>
+        </w:numPr>
+        <w:spacing w:after="100"/>
+      </w:pPr>
+      <w:r>
+        <w:rPr>
+          <w:sz w:val="22"/>
+          <w:szCs w:val="22"/>
+        </w:rPr>
+        <w:t xml:space="preserve">Make a small change and save. Does a "Saved!" message appear?</w:t>
       </w:r>
     </w:p>
     <w:p>
@@ -477,7 +430,7 @@
           <w:sz w:val="18"/>
           <w:szCs w:val="18"/>
         </w:rPr>
-        <w:t xml:space="preserve">Part 4 — Tracks</w:t>
+        <w:t xml:space="preserve">Part 4 -- The Study Viewer</w:t>
       </w:r>
     </w:p>
     <w:p>
@@ -485,142 +438,126 @@
         <w:spacing w:after="120"/>
       </w:pPr>
       <w:r>
-        <w:t xml:space="preserve">Tracks let you group studies into a series — like a sermon series or a book-by-book study.</w:t>
-      </w:r>
-    </w:p>
-    <w:p>
-      <w:pPr>
-        <w:pStyle w:val="ListParagraph"/>
-        <w:numPr>
-          <w:ilvl w:val="0"/>
-          <w:numId w:val="2"/>
-        </w:numPr>
-        <w:spacing w:after="100"/>
-      </w:pPr>
-      <w:r>
-        <w:rPr>
-          <w:sz w:val="22"/>
-          <w:szCs w:val="22"/>
-        </w:rPr>
-        <w:t xml:space="preserve">Go to Tracks in the left menu.</w:t>
-      </w:r>
-    </w:p>
-    <w:p>
-      <w:pPr>
-        <w:pStyle w:val="ListParagraph"/>
-        <w:numPr>
-          <w:ilvl w:val="0"/>
-          <w:numId w:val="2"/>
-        </w:numPr>
-        <w:spacing w:after="100"/>
-      </w:pPr>
-      <w:r>
-        <w:rPr>
-          <w:sz w:val="22"/>
-          <w:szCs w:val="22"/>
-        </w:rPr>
-        <w:t xml:space="preserve">Open an existing track, or create a new one with + New Track.</w:t>
-      </w:r>
-    </w:p>
-    <w:p>
-      <w:pPr>
-        <w:pStyle w:val="ListParagraph"/>
-        <w:numPr>
-          <w:ilvl w:val="0"/>
-          <w:numId w:val="2"/>
-        </w:numPr>
-        <w:spacing w:after="100"/>
-      </w:pPr>
-      <w:r>
-        <w:rPr>
-          <w:sz w:val="22"/>
-          <w:szCs w:val="22"/>
-        </w:rPr>
-        <w:t xml:space="preserve">Try adding a study to the track.</w:t>
-      </w:r>
-    </w:p>
-    <w:p>
-      <w:pPr>
-        <w:pStyle w:val="ListParagraph"/>
-        <w:numPr>
-          <w:ilvl w:val="0"/>
-          <w:numId w:val="2"/>
-        </w:numPr>
-        <w:spacing w:after="100"/>
-      </w:pPr>
-      <w:r>
-        <w:rPr>
-          <w:sz w:val="22"/>
-          <w:szCs w:val="22"/>
-        </w:rPr>
-        <w:t xml:space="preserve">Try reordering studies with the ↑ ↓ buttons.</w:t>
-      </w:r>
-    </w:p>
-    <w:p>
-      <w:pPr>
-        <w:pStyle w:val="ListParagraph"/>
-        <w:numPr>
-          <w:ilvl w:val="0"/>
-          <w:numId w:val="2"/>
-        </w:numPr>
-        <w:spacing w:after="100"/>
-      </w:pPr>
-      <w:r>
-        <w:rPr>
-          <w:sz w:val="22"/>
-          <w:szCs w:val="22"/>
-        </w:rPr>
-        <w:t xml:space="preserve">Tap View Track → to see how it looks to your audience.</w:t>
-      </w:r>
-    </w:p>
-    <w:p>
-      <w:pPr>
-        <w:spacing w:after="160"/>
-      </w:pPr>
-      <w:r>
-        <w:t xml:space="preserve"/>
-      </w:r>
-    </w:p>
-    <w:p>
-      <w:pPr>
-        <w:spacing w:after="120"/>
-      </w:pPr>
-      <w:r>
-        <w:t xml:space="preserve">Questions:</w:t>
-      </w:r>
-    </w:p>
-    <w:p>
-      <w:pPr>
-        <w:pStyle w:val="ListParagraph"/>
-        <w:numPr>
-          <w:ilvl w:val="0"/>
-          <w:numId w:val="3"/>
-        </w:numPr>
-        <w:spacing w:after="80"/>
-      </w:pPr>
-      <w:r>
-        <w:rPr>
-          <w:sz w:val="22"/>
-          <w:szCs w:val="22"/>
-        </w:rPr>
-        <w:t xml:space="preserve">Does the track layout make sense for how you organize your teachings?</w:t>
-      </w:r>
-    </w:p>
-    <w:p>
-      <w:pPr>
-        <w:pStyle w:val="ListParagraph"/>
-        <w:numPr>
-          <w:ilvl w:val="0"/>
-          <w:numId w:val="3"/>
-        </w:numPr>
-        <w:spacing w:after="80"/>
-      </w:pPr>
-      <w:r>
-        <w:rPr>
-          <w:sz w:val="22"/>
-          <w:szCs w:val="22"/>
-        </w:rPr>
-        <w:t xml:space="preserve">Is there anything about the order or presentation you'd change?</w:t>
+        <w:t xml:space="preserve">This is what your audience sees. Test it as a regular viewer would.</w:t>
+      </w:r>
+    </w:p>
+    <w:p>
+      <w:pPr>
+        <w:pStyle w:val="ListParagraph"/>
+        <w:numPr>
+          <w:ilvl w:val="0"/>
+          <w:numId w:val="2"/>
+        </w:numPr>
+        <w:spacing w:after="100"/>
+      </w:pPr>
+      <w:r>
+        <w:rPr>
+          <w:sz w:val="22"/>
+          <w:szCs w:val="22"/>
+        </w:rPr>
+        <w:t xml:space="preserve">Open a study that has both video and audio attached.</w:t>
+      </w:r>
+    </w:p>
+    <w:p>
+      <w:pPr>
+        <w:pStyle w:val="ListParagraph"/>
+        <w:numPr>
+          <w:ilvl w:val="0"/>
+          <w:numId w:val="2"/>
+        </w:numPr>
+        <w:spacing w:after="100"/>
+      </w:pPr>
+      <w:r>
+        <w:rPr>
+          <w:sz w:val="22"/>
+          <w:szCs w:val="22"/>
+        </w:rPr>
+        <w:t xml:space="preserve">You should see two toggle buttons at the top of the video area: "Video" and "Audio Only". Tap "Audio Only" -- does it switch to a centered audio player with the study title?</w:t>
+      </w:r>
+    </w:p>
+    <w:p>
+      <w:pPr>
+        <w:pStyle w:val="ListParagraph"/>
+        <w:numPr>
+          <w:ilvl w:val="0"/>
+          <w:numId w:val="2"/>
+        </w:numPr>
+        <w:spacing w:after="100"/>
+      </w:pPr>
+      <w:r>
+        <w:rPr>
+          <w:sz w:val="22"/>
+          <w:szCs w:val="22"/>
+        </w:rPr>
+        <w:t xml:space="preserve">Tap back to "Video" -- does the video return?</w:t>
+      </w:r>
+    </w:p>
+    <w:p>
+      <w:pPr>
+        <w:pStyle w:val="ListParagraph"/>
+        <w:numPr>
+          <w:ilvl w:val="0"/>
+          <w:numId w:val="2"/>
+        </w:numPr>
+        <w:spacing w:after="100"/>
+      </w:pPr>
+      <w:r>
+        <w:rPr>
+          <w:sz w:val="22"/>
+          <w:szCs w:val="22"/>
+        </w:rPr>
+        <w:t xml:space="preserve">Try the Scripture tab. Does the passage load? Try switching translations.</w:t>
+      </w:r>
+    </w:p>
+    <w:p>
+      <w:pPr>
+        <w:pStyle w:val="ListParagraph"/>
+        <w:numPr>
+          <w:ilvl w:val="0"/>
+          <w:numId w:val="2"/>
+        </w:numPr>
+        <w:spacing w:after="100"/>
+      </w:pPr>
+      <w:r>
+        <w:rPr>
+          <w:sz w:val="22"/>
+          <w:szCs w:val="22"/>
+        </w:rPr>
+        <w:t xml:space="preserve">Try the Notes tab -- type something and watch for "Saved" with a checkmark.</w:t>
+      </w:r>
+    </w:p>
+    <w:p>
+      <w:pPr>
+        <w:pStyle w:val="ListParagraph"/>
+        <w:numPr>
+          <w:ilvl w:val="0"/>
+          <w:numId w:val="2"/>
+        </w:numPr>
+        <w:spacing w:after="100"/>
+      </w:pPr>
+      <w:r>
+        <w:rPr>
+          <w:sz w:val="22"/>
+          <w:szCs w:val="22"/>
+        </w:rPr>
+        <w:t xml:space="preserve">If Related Studies are listed, tap one -- does a Bible passage appear on screen?</w:t>
+      </w:r>
+    </w:p>
+    <w:p>
+      <w:pPr>
+        <w:pStyle w:val="ListParagraph"/>
+        <w:numPr>
+          <w:ilvl w:val="0"/>
+          <w:numId w:val="2"/>
+        </w:numPr>
+        <w:spacing w:after="100"/>
+      </w:pPr>
+      <w:r>
+        <w:rPr>
+          <w:sz w:val="22"/>
+          <w:szCs w:val="22"/>
+        </w:rPr>
+        <w:t xml:space="preserve">Use the arrow buttons to move between studies in a track.</w:t>
       </w:r>
     </w:p>
     <w:p>
@@ -644,7 +581,7 @@
           <w:sz w:val="18"/>
           <w:szCs w:val="18"/>
         </w:rPr>
-        <w:t xml:space="preserve">Part 5 — Guest Codes</w:t>
+        <w:t xml:space="preserve">Part 5 -- Tracks</w:t>
       </w:r>
     </w:p>
     <w:p>
@@ -652,109 +589,75 @@
         <w:spacing w:after="120"/>
       </w:pPr>
       <w:r>
-        <w:t xml:space="preserve">This is how you give someone access without them needing to create an account — just share a passcode.</w:t>
-      </w:r>
-    </w:p>
-    <w:p>
-      <w:pPr>
-        <w:pStyle w:val="ListParagraph"/>
-        <w:numPr>
-          <w:ilvl w:val="0"/>
-          <w:numId w:val="2"/>
-        </w:numPr>
-        <w:spacing w:after="100"/>
-      </w:pPr>
-      <w:r>
-        <w:rPr>
-          <w:sz w:val="22"/>
-          <w:szCs w:val="22"/>
-        </w:rPr>
-        <w:t xml:space="preserve">Go to Guest Codes in the left menu.</w:t>
-      </w:r>
-    </w:p>
-    <w:p>
-      <w:pPr>
-        <w:pStyle w:val="ListParagraph"/>
-        <w:numPr>
-          <w:ilvl w:val="0"/>
-          <w:numId w:val="2"/>
-        </w:numPr>
-        <w:spacing w:after="100"/>
-      </w:pPr>
-      <w:r>
-        <w:rPr>
-          <w:sz w:val="22"/>
-          <w:szCs w:val="22"/>
-        </w:rPr>
-        <w:t xml:space="preserve">Create a new code with a label and link it to a track.</w:t>
-      </w:r>
-    </w:p>
-    <w:p>
-      <w:pPr>
-        <w:pStyle w:val="ListParagraph"/>
-        <w:numPr>
-          <w:ilvl w:val="0"/>
-          <w:numId w:val="2"/>
-        </w:numPr>
-        <w:spacing w:after="100"/>
-      </w:pPr>
-      <w:r>
-        <w:rPr>
-          <w:sz w:val="22"/>
-          <w:szCs w:val="22"/>
-        </w:rPr>
-        <w:t xml:space="preserve">Open a private/incognito browser window and go to the site.</w:t>
-      </w:r>
-    </w:p>
-    <w:p>
-      <w:pPr>
-        <w:pStyle w:val="ListParagraph"/>
-        <w:numPr>
-          <w:ilvl w:val="0"/>
-          <w:numId w:val="2"/>
-        </w:numPr>
-        <w:spacing w:after="100"/>
-      </w:pPr>
-      <w:r>
-        <w:rPr>
-          <w:sz w:val="22"/>
-          <w:szCs w:val="22"/>
-        </w:rPr>
-        <w:t xml:space="preserve">Tap "Enter Passcode" and type your new code.</w:t>
-      </w:r>
-    </w:p>
-    <w:p>
-      <w:pPr>
-        <w:pStyle w:val="ListParagraph"/>
-        <w:numPr>
-          <w:ilvl w:val="0"/>
-          <w:numId w:val="2"/>
-        </w:numPr>
-        <w:spacing w:after="100"/>
-      </w:pPr>
-      <w:r>
-        <w:rPr>
-          <w:sz w:val="22"/>
-          <w:szCs w:val="22"/>
-        </w:rPr>
-        <w:t xml:space="preserve">Does it take you to the right track?</w:t>
-      </w:r>
-    </w:p>
-    <w:p>
-      <w:pPr>
-        <w:pStyle w:val="ListParagraph"/>
-        <w:numPr>
-          <w:ilvl w:val="0"/>
-          <w:numId w:val="3"/>
-        </w:numPr>
-        <w:spacing w:after="80"/>
-      </w:pPr>
-      <w:r>
-        <w:rPr>
-          <w:sz w:val="22"/>
-          <w:szCs w:val="22"/>
-        </w:rPr>
-        <w:t xml:space="preserve">Does the page at the top say "Browsing as guest"?</w:t>
+        <w:t xml:space="preserve">Tracks group studies into a sequence, like a series or a book-by-book study.</w:t>
+      </w:r>
+    </w:p>
+    <w:p>
+      <w:pPr>
+        <w:pStyle w:val="ListParagraph"/>
+        <w:numPr>
+          <w:ilvl w:val="0"/>
+          <w:numId w:val="2"/>
+        </w:numPr>
+        <w:spacing w:after="100"/>
+      </w:pPr>
+      <w:r>
+        <w:rPr>
+          <w:sz w:val="22"/>
+          <w:szCs w:val="22"/>
+        </w:rPr>
+        <w:t xml:space="preserve">Go to Tracks and open an existing track or create a new one.</w:t>
+      </w:r>
+    </w:p>
+    <w:p>
+      <w:pPr>
+        <w:pStyle w:val="ListParagraph"/>
+        <w:numPr>
+          <w:ilvl w:val="0"/>
+          <w:numId w:val="2"/>
+        </w:numPr>
+        <w:spacing w:after="100"/>
+      </w:pPr>
+      <w:r>
+        <w:rPr>
+          <w:sz w:val="22"/>
+          <w:szCs w:val="22"/>
+        </w:rPr>
+        <w:t xml:space="preserve">Try adding a study and reordering with the up and down arrow buttons.</w:t>
+      </w:r>
+    </w:p>
+    <w:p>
+      <w:pPr>
+        <w:pStyle w:val="ListParagraph"/>
+        <w:numPr>
+          <w:ilvl w:val="0"/>
+          <w:numId w:val="2"/>
+        </w:numPr>
+        <w:spacing w:after="100"/>
+      </w:pPr>
+      <w:r>
+        <w:rPr>
+          <w:sz w:val="22"/>
+          <w:szCs w:val="22"/>
+        </w:rPr>
+        <w:t xml:space="preserve">Tap "View Track" to see the detail page. Does it look right?</w:t>
+      </w:r>
+    </w:p>
+    <w:p>
+      <w:pPr>
+        <w:pStyle w:val="ListParagraph"/>
+        <w:numPr>
+          <w:ilvl w:val="0"/>
+          <w:numId w:val="2"/>
+        </w:numPr>
+        <w:spacing w:after="100"/>
+      </w:pPr>
+      <w:r>
+        <w:rPr>
+          <w:sz w:val="22"/>
+          <w:szCs w:val="22"/>
+        </w:rPr>
+        <w:t xml:space="preserve">Check that the first study says "Start" and the rest say "View".</w:t>
       </w:r>
     </w:p>
     <w:p>
@@ -778,75 +681,100 @@
           <w:sz w:val="18"/>
           <w:szCs w:val="18"/>
         </w:rPr>
-        <w:t xml:space="preserve">Part 6 — Books</w:t>
-      </w:r>
-    </w:p>
-    <w:p>
-      <w:pPr>
-        <w:pStyle w:val="ListParagraph"/>
-        <w:numPr>
-          <w:ilvl w:val="0"/>
-          <w:numId w:val="2"/>
-        </w:numPr>
-        <w:spacing w:after="100"/>
-      </w:pPr>
-      <w:r>
-        <w:rPr>
-          <w:sz w:val="22"/>
-          <w:szCs w:val="22"/>
-        </w:rPr>
-        <w:t xml:space="preserve">Go to Books in the left menu.</w:t>
-      </w:r>
-    </w:p>
-    <w:p>
-      <w:pPr>
-        <w:pStyle w:val="ListParagraph"/>
-        <w:numPr>
-          <w:ilvl w:val="0"/>
-          <w:numId w:val="2"/>
-        </w:numPr>
-        <w:spacing w:after="100"/>
-      </w:pPr>
-      <w:r>
-        <w:rPr>
-          <w:sz w:val="22"/>
-          <w:szCs w:val="22"/>
-        </w:rPr>
-        <w:t xml:space="preserve">Tap into a book (e.g. Genesis or John).</w:t>
-      </w:r>
-    </w:p>
-    <w:p>
-      <w:pPr>
-        <w:pStyle w:val="ListParagraph"/>
-        <w:numPr>
-          <w:ilvl w:val="0"/>
-          <w:numId w:val="2"/>
-        </w:numPr>
-        <w:spacing w:after="100"/>
-      </w:pPr>
-      <w:r>
-        <w:rPr>
-          <w:sz w:val="22"/>
-          <w:szCs w:val="22"/>
-        </w:rPr>
-        <w:t xml:space="preserve">Does it show the studies you've added for that book?</w:t>
-      </w:r>
-    </w:p>
-    <w:p>
-      <w:pPr>
-        <w:pStyle w:val="ListParagraph"/>
-        <w:numPr>
-          <w:ilvl w:val="0"/>
-          <w:numId w:val="2"/>
-        </w:numPr>
-        <w:spacing w:after="100"/>
-      </w:pPr>
-      <w:r>
-        <w:rPr>
-          <w:sz w:val="22"/>
-          <w:szCs w:val="22"/>
-        </w:rPr>
-        <w:t xml:space="preserve">Does the layout make sense to you?</w:t>
+        <w:t xml:space="preserve">Part 6 -- Guest Codes</w:t>
+      </w:r>
+    </w:p>
+    <w:p>
+      <w:pPr>
+        <w:spacing w:after="120"/>
+      </w:pPr>
+      <w:r>
+        <w:t xml:space="preserve">Guest codes let someone access the app without creating an account. Each code can route to a specific track automatically.</w:t>
+      </w:r>
+    </w:p>
+    <w:p>
+      <w:pPr>
+        <w:pStyle w:val="ListParagraph"/>
+        <w:numPr>
+          <w:ilvl w:val="0"/>
+          <w:numId w:val="2"/>
+        </w:numPr>
+        <w:spacing w:after="100"/>
+      </w:pPr>
+      <w:r>
+        <w:rPr>
+          <w:sz w:val="22"/>
+          <w:szCs w:val="22"/>
+        </w:rPr>
+        <w:t xml:space="preserve">Go to Guest Codes in the left menu.</w:t>
+      </w:r>
+    </w:p>
+    <w:p>
+      <w:pPr>
+        <w:pStyle w:val="ListParagraph"/>
+        <w:numPr>
+          <w:ilvl w:val="0"/>
+          <w:numId w:val="2"/>
+        </w:numPr>
+        <w:spacing w:after="100"/>
+      </w:pPr>
+      <w:r>
+        <w:rPr>
+          <w:sz w:val="22"/>
+          <w:szCs w:val="22"/>
+        </w:rPr>
+        <w:t xml:space="preserve">Create a new code. Give it a label and link it to a track.</w:t>
+      </w:r>
+    </w:p>
+    <w:p>
+      <w:pPr>
+        <w:pStyle w:val="ListParagraph"/>
+        <w:numPr>
+          <w:ilvl w:val="0"/>
+          <w:numId w:val="2"/>
+        </w:numPr>
+        <w:spacing w:after="100"/>
+      </w:pPr>
+      <w:r>
+        <w:rPr>
+          <w:sz w:val="22"/>
+          <w:szCs w:val="22"/>
+        </w:rPr>
+        <w:t xml:space="preserve">Open a private or incognito browser window and go to the site URL.</w:t>
+      </w:r>
+    </w:p>
+    <w:p>
+      <w:pPr>
+        <w:pStyle w:val="ListParagraph"/>
+        <w:numPr>
+          <w:ilvl w:val="0"/>
+          <w:numId w:val="2"/>
+        </w:numPr>
+        <w:spacing w:after="100"/>
+      </w:pPr>
+      <w:r>
+        <w:rPr>
+          <w:sz w:val="22"/>
+          <w:szCs w:val="22"/>
+        </w:rPr>
+        <w:t xml:space="preserve">On the welcome page, tap "Enter Passcode" and type your code in lowercase letters to test that it still works.</w:t>
+      </w:r>
+    </w:p>
+    <w:p>
+      <w:pPr>
+        <w:pStyle w:val="ListParagraph"/>
+        <w:numPr>
+          <w:ilvl w:val="0"/>
+          <w:numId w:val="2"/>
+        </w:numPr>
+        <w:spacing w:after="100"/>
+      </w:pPr>
+      <w:r>
+        <w:rPr>
+          <w:sz w:val="22"/>
+          <w:szCs w:val="22"/>
+        </w:rPr>
+        <w:t xml:space="preserve">Does it take you to the correct track? Does the banner say "Browsing as guest"?</w:t>
       </w:r>
     </w:p>
     <w:p>
@@ -870,7 +798,7 @@
           <w:sz w:val="18"/>
           <w:szCs w:val="18"/>
         </w:rPr>
-        <w:t xml:space="preserve">Part 7 — Mobile Check</w:t>
+        <w:t xml:space="preserve">Part 7 -- Mobile Check</w:t>
       </w:r>
     </w:p>
     <w:p>
@@ -878,7 +806,7 @@
         <w:spacing w:after="120"/>
       </w:pPr>
       <w:r>
-        <w:t xml:space="preserve">If you haven't tested on your phone yet, open the site on your phone and go through a study.</w:t>
+        <w:t xml:space="preserve">Open the site on your phone and go through a study if you have not already.</w:t>
       </w:r>
     </w:p>
     <w:p>
@@ -895,7 +823,7 @@
           <w:sz w:val="22"/>
           <w:szCs w:val="22"/>
         </w:rPr>
-        <w:t xml:space="preserve">Does the video play without issues?</w:t>
+        <w:t xml:space="preserve">Does the video and audio toggle work on mobile?</w:t>
       </w:r>
     </w:p>
     <w:p>
@@ -912,7 +840,7 @@
           <w:sz w:val="22"/>
           <w:szCs w:val="22"/>
         </w:rPr>
-        <w:t xml:space="preserve">Are the tabs (Scripture / Notes / Related) easy to use?</w:t>
+        <w:t xml:space="preserve">Are the Scripture, Notes, and Related tabs easy to use?</w:t>
       </w:r>
     </w:p>
     <w:p>
@@ -929,7 +857,7 @@
           <w:sz w:val="22"/>
           <w:szCs w:val="22"/>
         </w:rPr>
-        <w:t xml:space="preserve">Is the text size comfortable?</w:t>
+        <w:t xml:space="preserve">Can you navigate between studies with the arrows?</w:t>
       </w:r>
     </w:p>
     <w:p>
@@ -946,7 +874,7 @@
           <w:sz w:val="22"/>
           <w:szCs w:val="22"/>
         </w:rPr>
-        <w:t xml:space="preserve">Can you navigate between studies easily?</w:t>
+        <w:t xml:space="preserve">Is the text comfortable to read?</w:t>
       </w:r>
     </w:p>
     <w:p>
@@ -1023,7 +951,7 @@
         <w:pBdr>
           <w:bottom w:val="single" w:color="e2e8f0" w:sz="2" w:space="1"/>
         </w:pBdr>
-        <w:spacing w:after="160"/>
+        <w:spacing w:after="60"/>
       </w:pPr>
       <w:r>
         <w:rPr>
@@ -1031,6 +959,14 @@
           <w:szCs w:val="22"/>
         </w:rPr>
         <w:t xml:space="preserve">      </w:t>
+      </w:r>
+    </w:p>
+    <w:p>
+      <w:pPr>
+        <w:spacing w:after="120"/>
+      </w:pPr>
+      <w:r>
+        <w:t xml:space="preserve"/>
       </w:r>
     </w:p>
     <w:p>
@@ -1044,7 +980,7 @@
           <w:sz w:val="22"/>
           <w:szCs w:val="22"/>
         </w:rPr>
-        <w:t xml:space="preserve">2.  Does the Seeds section feel useful for your notes and references?</w:t>
+        <w:t xml:space="preserve">2.  Does the Seeds section feel useful for your open text file notes and references?</w:t>
       </w:r>
     </w:p>
     <w:p>
@@ -1067,7 +1003,7 @@
         <w:pBdr>
           <w:bottom w:val="single" w:color="e2e8f0" w:sz="2" w:space="1"/>
         </w:pBdr>
-        <w:spacing w:after="160"/>
+        <w:spacing w:after="60"/>
       </w:pPr>
       <w:r>
         <w:rPr>
@@ -1075,6 +1011,14 @@
           <w:szCs w:val="22"/>
         </w:rPr>
         <w:t xml:space="preserve">      </w:t>
+      </w:r>
+    </w:p>
+    <w:p>
+      <w:pPr>
+        <w:spacing w:after="120"/>
+      </w:pPr>
+      <w:r>
+        <w:t xml:space="preserve"/>
       </w:r>
     </w:p>
     <w:p>
@@ -1088,7 +1032,7 @@
           <w:sz w:val="22"/>
           <w:szCs w:val="22"/>
         </w:rPr>
-        <w:t xml:space="preserve">3.  Is there anything you expected to find that wasn't there?</w:t>
+        <w:t xml:space="preserve">3.  Did the video and audio toggle feel intuitive?</w:t>
       </w:r>
     </w:p>
     <w:p>
@@ -1111,7 +1055,7 @@
         <w:pBdr>
           <w:bottom w:val="single" w:color="e2e8f0" w:sz="2" w:space="1"/>
         </w:pBdr>
-        <w:spacing w:after="160"/>
+        <w:spacing w:after="60"/>
       </w:pPr>
       <w:r>
         <w:rPr>
@@ -1119,6 +1063,14 @@
           <w:szCs w:val="22"/>
         </w:rPr>
         <w:t xml:space="preserve">      </w:t>
+      </w:r>
+    </w:p>
+    <w:p>
+      <w:pPr>
+        <w:spacing w:after="120"/>
+      </w:pPr>
+      <w:r>
+        <w:t xml:space="preserve"/>
       </w:r>
     </w:p>
     <w:p>
@@ -1132,7 +1084,7 @@
           <w:sz w:val="22"/>
           <w:szCs w:val="22"/>
         </w:rPr>
-        <w:t xml:space="preserve">4.  What's the one thing you'd most want added or changed?</w:t>
+        <w:t xml:space="preserve">4.  Is there anything you expected to find that was not there?</w:t>
       </w:r>
     </w:p>
     <w:p>
@@ -1155,7 +1107,7 @@
         <w:pBdr>
           <w:bottom w:val="single" w:color="e2e8f0" w:sz="2" w:space="1"/>
         </w:pBdr>
-        <w:spacing w:after="160"/>
+        <w:spacing w:after="60"/>
       </w:pPr>
       <w:r>
         <w:rPr>
@@ -1163,6 +1115,14 @@
           <w:szCs w:val="22"/>
         </w:rPr>
         <w:t xml:space="preserve">      </w:t>
+      </w:r>
+    </w:p>
+    <w:p>
+      <w:pPr>
+        <w:spacing w:after="120"/>
+      </w:pPr>
+      <w:r>
+        <w:t xml:space="preserve"/>
       </w:r>
     </w:p>
     <w:p>
@@ -1176,7 +1136,7 @@
           <w:sz w:val="22"/>
           <w:szCs w:val="22"/>
         </w:rPr>
-        <w:t xml:space="preserve">5.  Any studies, books, or tracks you want to set up next?</w:t>
+        <w:t xml:space="preserve">5.  What is the one thing you would most want added or changed?</w:t>
       </w:r>
     </w:p>
     <w:p>
@@ -1199,7 +1159,7 @@
         <w:pBdr>
           <w:bottom w:val="single" w:color="e2e8f0" w:sz="2" w:space="1"/>
         </w:pBdr>
-        <w:spacing w:after="160"/>
+        <w:spacing w:after="60"/>
       </w:pPr>
       <w:r>
         <w:rPr>
@@ -1207,6 +1167,14 @@
           <w:szCs w:val="22"/>
         </w:rPr>
         <w:t xml:space="preserve">      </w:t>
+      </w:r>
+    </w:p>
+    <w:p>
+      <w:pPr>
+        <w:spacing w:after="120"/>
+      </w:pPr>
+      <w:r>
+        <w:t xml:space="preserve"/>
       </w:r>
     </w:p>
     <w:p>
@@ -1229,7 +1197,7 @@
           <w:sz w:val="22"/>
           <w:szCs w:val="22"/>
         </w:rPr>
-        <w:t xml:space="preserve">Thank you — this is going to be something really special.</w:t>
+        <w:t xml:space="preserve">Thank you -- this is going to be something really special.</w:t>
       </w:r>
     </w:p>
     <w:sectPr>
@@ -1670,23 +1638,5 @@
       <w:szCs w:val="26"/>
     </w:rPr>
   </w:style>
-  <w:style w:type="paragraph" w:styleId="Heading3">
-    <w:name w:val="Heading 3"/>
-    <w:basedOn w:val="Normal"/>
-    <w:next w:val="Normal"/>
-    <w:qFormat/>
-    <w:pPr>
-      <w:spacing w:after="80" w:before="160"/>
-      <w:outlineLvl w:val="2"/>
-    </w:pPr>
-    <w:rPr>
-      <w:rFonts w:ascii="Arial" w:cs="Arial" w:eastAsia="Arial" w:hAnsi="Arial"/>
-      <w:b/>
-      <w:bCs/>
-      <w:color w:val="444444"/>
-      <w:sz w:val="22"/>
-      <w:szCs w:val="22"/>
-    </w:rPr>
-  </w:style>
 </w:styles>
 </file>
</xml_diff>